<commit_message>
Rename genalldocs to gendocs and add md-hash metadata
</commit_message>
<xml_diff>
--- a/docs/docx/Glossary_Reference.docx
+++ b/docs/docx/Glossary_Reference.docx
@@ -2129,7 +2129,7 @@
         </w:trPr>
         <w:tc>
           <w:tcPr>
-            <w:tcW w:type="dxa" w:w="4164"/>
+            <w:tcW w:type="dxa" w:w="4204"/>
             <w:tcBorders>
               <w:bottom w:sz="3.184000015258789" w:val="single" w:color="#000000"/>
             </w:tcBorders>
@@ -2161,7 +2161,7 @@
         </w:tc>
         <w:tc>
           <w:tcPr>
-            <w:tcW w:type="dxa" w:w="5204"/>
+            <w:tcW w:type="dxa" w:w="5164"/>
             <w:tcBorders>
               <w:bottom w:sz="3.184000015258789" w:val="single" w:color="#000000"/>
             </w:tcBorders>
@@ -2176,7 +2176,7 @@
               <w:autoSpaceDE w:val="0"/>
               <w:widowControl/>
               <w:spacing w:line="200" w:lineRule="exact" w:before="0" w:after="0"/>
-              <w:ind w:left="0" w:right="2" w:firstLine="0"/>
+              <w:ind w:left="0" w:right="4" w:firstLine="0"/>
               <w:jc w:val="right"/>
             </w:pPr>
             <w:r>
@@ -2187,17 +2187,7 @@
                 <w:color w:val="000000"/>
                 <w:sz w:val="20"/>
               </w:rPr>
-              <w:t>Glossary</w:t>
-            </w:r>
-            <w:r>
-              <w:rPr>
-                <w:rFonts w:ascii="LMRoman10" w:hAnsi="LMRoman10" w:eastAsia="LMRoman10"/>
-                <w:b w:val="0"/>
-                <w:i w:val="0"/>
-                <w:color w:val="000000"/>
-                <w:sz w:val="20"/>
-              </w:rPr>
-              <w:t>Reference</w:t>
+              <w:t>tmp.ocTMI0Grw2</w:t>
             </w:r>
           </w:p>
         </w:tc>
@@ -4745,7 +4735,7 @@
         </w:trPr>
         <w:tc>
           <w:tcPr>
-            <w:tcW w:type="dxa" w:w="4724"/>
+            <w:tcW w:type="dxa" w:w="4684"/>
             <w:tcBorders>
               <w:bottom w:sz="3.184000015258789" w:val="single" w:color="#000000"/>
             </w:tcBorders>
@@ -4771,23 +4761,13 @@
                 <w:color w:val="000000"/>
                 <w:sz w:val="20"/>
               </w:rPr>
-              <w:t>Glossary</w:t>
-            </w:r>
-            <w:r>
-              <w:rPr>
-                <w:rFonts w:ascii="LMRoman10" w:hAnsi="LMRoman10" w:eastAsia="LMRoman10"/>
-                <w:b w:val="0"/>
-                <w:i w:val="0"/>
-                <w:color w:val="000000"/>
-                <w:sz w:val="20"/>
-              </w:rPr>
-              <w:t>Reference</w:t>
+              <w:t>tmp.ocTMI0Grw2</w:t>
             </w:r>
           </w:p>
         </w:tc>
         <w:tc>
           <w:tcPr>
-            <w:tcW w:type="dxa" w:w="4644"/>
+            <w:tcW w:type="dxa" w:w="4684"/>
             <w:tcBorders>
               <w:bottom w:sz="3.184000015258789" w:val="single" w:color="#000000"/>
             </w:tcBorders>
@@ -4802,7 +4782,7 @@
               <w:autoSpaceDE w:val="0"/>
               <w:widowControl/>
               <w:spacing w:line="200" w:lineRule="exact" w:before="0" w:after="0"/>
-              <w:ind w:left="0" w:right="2" w:firstLine="0"/>
+              <w:ind w:left="0" w:right="4" w:firstLine="0"/>
               <w:jc w:val="right"/>
             </w:pPr>
             <w:r>
@@ -5125,7 +5105,7 @@
         </w:trPr>
         <w:tc>
           <w:tcPr>
-            <w:tcW w:type="dxa" w:w="4844"/>
+            <w:tcW w:type="dxa" w:w="4804"/>
             <w:tcBorders>
               <w:bottom w:sz="3.184000015258789" w:val="single" w:color="#000000"/>
             </w:tcBorders>
@@ -5151,23 +5131,13 @@
                 <w:color w:val="000000"/>
                 <w:sz w:val="20"/>
               </w:rPr>
-              <w:t>Glossary</w:t>
-            </w:r>
-            <w:r>
-              <w:rPr>
-                <w:rFonts w:ascii="LMRoman10" w:hAnsi="LMRoman10" w:eastAsia="LMRoman10"/>
-                <w:b w:val="0"/>
-                <w:i w:val="0"/>
-                <w:color w:val="000000"/>
-                <w:sz w:val="20"/>
-              </w:rPr>
-              <w:t>Reference</w:t>
+              <w:t>tmp.ocTMI0Grw2</w:t>
             </w:r>
           </w:p>
         </w:tc>
         <w:tc>
           <w:tcPr>
-            <w:tcW w:type="dxa" w:w="4524"/>
+            <w:tcW w:type="dxa" w:w="4564"/>
             <w:tcBorders>
               <w:bottom w:sz="3.184000015258789" w:val="single" w:color="#000000"/>
             </w:tcBorders>
@@ -5182,7 +5152,7 @@
               <w:autoSpaceDE w:val="0"/>
               <w:widowControl/>
               <w:spacing w:line="200" w:lineRule="exact" w:before="0" w:after="0"/>
-              <w:ind w:left="0" w:right="2" w:firstLine="0"/>
+              <w:ind w:left="0" w:right="4" w:firstLine="0"/>
               <w:jc w:val="right"/>
             </w:pPr>
             <w:r>
@@ -6171,7 +6141,7 @@
         </w:trPr>
         <w:tc>
           <w:tcPr>
-            <w:tcW w:type="dxa" w:w="4344"/>
+            <w:tcW w:type="dxa" w:w="4384"/>
             <w:tcBorders>
               <w:bottom w:sz="3.184000015258789" w:val="single" w:color="#000000"/>
             </w:tcBorders>
@@ -6213,7 +6183,7 @@
         </w:tc>
         <w:tc>
           <w:tcPr>
-            <w:tcW w:type="dxa" w:w="5024"/>
+            <w:tcW w:type="dxa" w:w="4984"/>
             <w:tcBorders>
               <w:bottom w:sz="3.184000015258789" w:val="single" w:color="#000000"/>
             </w:tcBorders>
@@ -6228,7 +6198,7 @@
               <w:autoSpaceDE w:val="0"/>
               <w:widowControl/>
               <w:spacing w:line="200" w:lineRule="exact" w:before="0" w:after="0"/>
-              <w:ind w:left="0" w:right="2" w:firstLine="0"/>
+              <w:ind w:left="0" w:right="4" w:firstLine="0"/>
               <w:jc w:val="right"/>
             </w:pPr>
             <w:r>
@@ -6239,17 +6209,7 @@
                 <w:color w:val="000000"/>
                 <w:sz w:val="20"/>
               </w:rPr>
-              <w:t>Glossary</w:t>
-            </w:r>
-            <w:r>
-              <w:rPr>
-                <w:rFonts w:ascii="LMRoman10" w:hAnsi="LMRoman10" w:eastAsia="LMRoman10"/>
-                <w:b w:val="0"/>
-                <w:i w:val="0"/>
-                <w:color w:val="000000"/>
-                <w:sz w:val="20"/>
-              </w:rPr>
-              <w:t>Reference</w:t>
+              <w:t>tmp.ocTMI0Grw2</w:t>
             </w:r>
           </w:p>
         </w:tc>
@@ -11049,7 +11009,7 @@
         </w:trPr>
         <w:tc>
           <w:tcPr>
-            <w:tcW w:type="dxa" w:w="5004"/>
+            <w:tcW w:type="dxa" w:w="4964"/>
             <w:tcBorders>
               <w:bottom w:sz="3.184000015258789" w:val="single" w:color="#000000"/>
             </w:tcBorders>
@@ -11075,23 +11035,13 @@
                 <w:color w:val="000000"/>
                 <w:sz w:val="20"/>
               </w:rPr>
-              <w:t>Glossary</w:t>
-            </w:r>
-            <w:r>
-              <w:rPr>
-                <w:rFonts w:ascii="LMRoman10" w:hAnsi="LMRoman10" w:eastAsia="LMRoman10"/>
-                <w:b w:val="0"/>
-                <w:i w:val="0"/>
-                <w:color w:val="000000"/>
-                <w:sz w:val="20"/>
-              </w:rPr>
-              <w:t>Reference</w:t>
+              <w:t>tmp.ocTMI0Grw2</w:t>
             </w:r>
           </w:p>
         </w:tc>
         <w:tc>
           <w:tcPr>
-            <w:tcW w:type="dxa" w:w="4364"/>
+            <w:tcW w:type="dxa" w:w="4404"/>
             <w:tcBorders>
               <w:bottom w:sz="3.184000015258789" w:val="single" w:color="#000000"/>
             </w:tcBorders>
@@ -15011,7 +14961,7 @@
         </w:trPr>
         <w:tc>
           <w:tcPr>
-            <w:tcW w:type="dxa" w:w="4344"/>
+            <w:tcW w:type="dxa" w:w="4384"/>
             <w:tcBorders>
               <w:bottom w:sz="3.184000015258789" w:val="single" w:color="#000000"/>
             </w:tcBorders>
@@ -15053,7 +15003,7 @@
         </w:tc>
         <w:tc>
           <w:tcPr>
-            <w:tcW w:type="dxa" w:w="5024"/>
+            <w:tcW w:type="dxa" w:w="4984"/>
             <w:tcBorders>
               <w:bottom w:sz="3.184000015258789" w:val="single" w:color="#000000"/>
             </w:tcBorders>
@@ -15068,7 +15018,7 @@
               <w:autoSpaceDE w:val="0"/>
               <w:widowControl/>
               <w:spacing w:line="200" w:lineRule="exact" w:before="0" w:after="0"/>
-              <w:ind w:left="0" w:right="2" w:firstLine="0"/>
+              <w:ind w:left="0" w:right="4" w:firstLine="0"/>
               <w:jc w:val="right"/>
             </w:pPr>
             <w:r>
@@ -15079,17 +15029,7 @@
                 <w:color w:val="000000"/>
                 <w:sz w:val="20"/>
               </w:rPr>
-              <w:t>Glossary</w:t>
-            </w:r>
-            <w:r>
-              <w:rPr>
-                <w:rFonts w:ascii="LMRoman10" w:hAnsi="LMRoman10" w:eastAsia="LMRoman10"/>
-                <w:b w:val="0"/>
-                <w:i w:val="0"/>
-                <w:color w:val="000000"/>
-                <w:sz w:val="20"/>
-              </w:rPr>
-              <w:t>Reference</w:t>
+              <w:t>tmp.ocTMI0Grw2</w:t>
             </w:r>
           </w:p>
         </w:tc>
@@ -19064,7 +19004,7 @@
         </w:trPr>
         <w:tc>
           <w:tcPr>
-            <w:tcW w:type="dxa" w:w="5004"/>
+            <w:tcW w:type="dxa" w:w="4964"/>
             <w:tcBorders>
               <w:bottom w:sz="3.184000015258789" w:val="single" w:color="#000000"/>
             </w:tcBorders>
@@ -19090,23 +19030,13 @@
                 <w:color w:val="000000"/>
                 <w:sz w:val="20"/>
               </w:rPr>
-              <w:t>Glossary</w:t>
-            </w:r>
-            <w:r>
-              <w:rPr>
-                <w:rFonts w:ascii="LMRoman10" w:hAnsi="LMRoman10" w:eastAsia="LMRoman10"/>
-                <w:b w:val="0"/>
-                <w:i w:val="0"/>
-                <w:color w:val="000000"/>
-                <w:sz w:val="20"/>
-              </w:rPr>
-              <w:t>Reference</w:t>
+              <w:t>tmp.ocTMI0Grw2</w:t>
             </w:r>
           </w:p>
         </w:tc>
         <w:tc>
           <w:tcPr>
-            <w:tcW w:type="dxa" w:w="4364"/>
+            <w:tcW w:type="dxa" w:w="4404"/>
             <w:tcBorders>
               <w:bottom w:sz="3.184000015258789" w:val="single" w:color="#000000"/>
             </w:tcBorders>
@@ -24017,7 +23947,7 @@
         </w:trPr>
         <w:tc>
           <w:tcPr>
-            <w:tcW w:type="dxa" w:w="4344"/>
+            <w:tcW w:type="dxa" w:w="4384"/>
             <w:tcBorders>
               <w:bottom w:sz="3.184000015258789" w:val="single" w:color="#000000"/>
             </w:tcBorders>
@@ -24059,7 +23989,7 @@
         </w:tc>
         <w:tc>
           <w:tcPr>
-            <w:tcW w:type="dxa" w:w="5024"/>
+            <w:tcW w:type="dxa" w:w="4984"/>
             <w:tcBorders>
               <w:bottom w:sz="3.184000015258789" w:val="single" w:color="#000000"/>
             </w:tcBorders>
@@ -24074,7 +24004,7 @@
               <w:autoSpaceDE w:val="0"/>
               <w:widowControl/>
               <w:spacing w:line="200" w:lineRule="exact" w:before="0" w:after="0"/>
-              <w:ind w:left="0" w:right="2" w:firstLine="0"/>
+              <w:ind w:left="0" w:right="4" w:firstLine="0"/>
               <w:jc w:val="right"/>
             </w:pPr>
             <w:r>
@@ -24085,17 +24015,7 @@
                 <w:color w:val="000000"/>
                 <w:sz w:val="20"/>
               </w:rPr>
-              <w:t>Glossary</w:t>
-            </w:r>
-            <w:r>
-              <w:rPr>
-                <w:rFonts w:ascii="LMRoman10" w:hAnsi="LMRoman10" w:eastAsia="LMRoman10"/>
-                <w:b w:val="0"/>
-                <w:i w:val="0"/>
-                <w:color w:val="000000"/>
-                <w:sz w:val="20"/>
-              </w:rPr>
-              <w:t>Reference</w:t>
+              <w:t>tmp.ocTMI0Grw2</w:t>
             </w:r>
           </w:p>
         </w:tc>
@@ -29581,7 +29501,7 @@
         </w:trPr>
         <w:tc>
           <w:tcPr>
-            <w:tcW w:type="dxa" w:w="5004"/>
+            <w:tcW w:type="dxa" w:w="4964"/>
             <w:tcBorders>
               <w:bottom w:sz="3.184000015258789" w:val="single" w:color="#000000"/>
             </w:tcBorders>
@@ -29607,23 +29527,13 @@
                 <w:color w:val="000000"/>
                 <w:sz w:val="20"/>
               </w:rPr>
-              <w:t>Glossary</w:t>
-            </w:r>
-            <w:r>
-              <w:rPr>
-                <w:rFonts w:ascii="LMRoman10" w:hAnsi="LMRoman10" w:eastAsia="LMRoman10"/>
-                <w:b w:val="0"/>
-                <w:i w:val="0"/>
-                <w:color w:val="000000"/>
-                <w:sz w:val="20"/>
-              </w:rPr>
-              <w:t>Reference</w:t>
+              <w:t>tmp.ocTMI0Grw2</w:t>
             </w:r>
           </w:p>
         </w:tc>
         <w:tc>
           <w:tcPr>
-            <w:tcW w:type="dxa" w:w="4364"/>
+            <w:tcW w:type="dxa" w:w="4404"/>
             <w:tcBorders>
               <w:bottom w:sz="3.184000015258789" w:val="single" w:color="#000000"/>
             </w:tcBorders>

</xml_diff>

<commit_message>
Update docs tooling checks and script/test headers
</commit_message>
<xml_diff>
--- a/docs/docx/Glossary_Reference.docx
+++ b/docs/docx/Glossary_Reference.docx
@@ -2129,7 +2129,7 @@
         </w:trPr>
         <w:tc>
           <w:tcPr>
-            <w:tcW w:type="dxa" w:w="4204"/>
+            <w:tcW w:type="dxa" w:w="4164"/>
             <w:tcBorders>
               <w:bottom w:sz="3.184000015258789" w:val="single" w:color="#000000"/>
             </w:tcBorders>
@@ -2161,7 +2161,7 @@
         </w:tc>
         <w:tc>
           <w:tcPr>
-            <w:tcW w:type="dxa" w:w="5164"/>
+            <w:tcW w:type="dxa" w:w="5204"/>
             <w:tcBorders>
               <w:bottom w:sz="3.184000015258789" w:val="single" w:color="#000000"/>
             </w:tcBorders>
@@ -2176,7 +2176,7 @@
               <w:autoSpaceDE w:val="0"/>
               <w:widowControl/>
               <w:spacing w:line="200" w:lineRule="exact" w:before="0" w:after="0"/>
-              <w:ind w:left="0" w:right="4" w:firstLine="0"/>
+              <w:ind w:left="0" w:right="2" w:firstLine="0"/>
               <w:jc w:val="right"/>
             </w:pPr>
             <w:r>
@@ -2187,7 +2187,17 @@
                 <w:color w:val="000000"/>
                 <w:sz w:val="20"/>
               </w:rPr>
-              <w:t>tmp.ocTMI0Grw2</w:t>
+              <w:t>Glossary</w:t>
+            </w:r>
+            <w:r>
+              <w:rPr>
+                <w:rFonts w:ascii="LMRoman10" w:hAnsi="LMRoman10" w:eastAsia="LMRoman10"/>
+                <w:b w:val="0"/>
+                <w:i w:val="0"/>
+                <w:color w:val="000000"/>
+                <w:sz w:val="20"/>
+              </w:rPr>
+              <w:t>Reference</w:t>
             </w:r>
           </w:p>
         </w:tc>
@@ -4735,7 +4745,7 @@
         </w:trPr>
         <w:tc>
           <w:tcPr>
-            <w:tcW w:type="dxa" w:w="4684"/>
+            <w:tcW w:type="dxa" w:w="4724"/>
             <w:tcBorders>
               <w:bottom w:sz="3.184000015258789" w:val="single" w:color="#000000"/>
             </w:tcBorders>
@@ -4761,13 +4771,23 @@
                 <w:color w:val="000000"/>
                 <w:sz w:val="20"/>
               </w:rPr>
-              <w:t>tmp.ocTMI0Grw2</w:t>
+              <w:t>Glossary</w:t>
+            </w:r>
+            <w:r>
+              <w:rPr>
+                <w:rFonts w:ascii="LMRoman10" w:hAnsi="LMRoman10" w:eastAsia="LMRoman10"/>
+                <w:b w:val="0"/>
+                <w:i w:val="0"/>
+                <w:color w:val="000000"/>
+                <w:sz w:val="20"/>
+              </w:rPr>
+              <w:t>Reference</w:t>
             </w:r>
           </w:p>
         </w:tc>
         <w:tc>
           <w:tcPr>
-            <w:tcW w:type="dxa" w:w="4684"/>
+            <w:tcW w:type="dxa" w:w="4644"/>
             <w:tcBorders>
               <w:bottom w:sz="3.184000015258789" w:val="single" w:color="#000000"/>
             </w:tcBorders>
@@ -4782,7 +4802,7 @@
               <w:autoSpaceDE w:val="0"/>
               <w:widowControl/>
               <w:spacing w:line="200" w:lineRule="exact" w:before="0" w:after="0"/>
-              <w:ind w:left="0" w:right="4" w:firstLine="0"/>
+              <w:ind w:left="0" w:right="2" w:firstLine="0"/>
               <w:jc w:val="right"/>
             </w:pPr>
             <w:r>
@@ -5105,7 +5125,7 @@
         </w:trPr>
         <w:tc>
           <w:tcPr>
-            <w:tcW w:type="dxa" w:w="4804"/>
+            <w:tcW w:type="dxa" w:w="4844"/>
             <w:tcBorders>
               <w:bottom w:sz="3.184000015258789" w:val="single" w:color="#000000"/>
             </w:tcBorders>
@@ -5131,13 +5151,23 @@
                 <w:color w:val="000000"/>
                 <w:sz w:val="20"/>
               </w:rPr>
-              <w:t>tmp.ocTMI0Grw2</w:t>
+              <w:t>Glossary</w:t>
+            </w:r>
+            <w:r>
+              <w:rPr>
+                <w:rFonts w:ascii="LMRoman10" w:hAnsi="LMRoman10" w:eastAsia="LMRoman10"/>
+                <w:b w:val="0"/>
+                <w:i w:val="0"/>
+                <w:color w:val="000000"/>
+                <w:sz w:val="20"/>
+              </w:rPr>
+              <w:t>Reference</w:t>
             </w:r>
           </w:p>
         </w:tc>
         <w:tc>
           <w:tcPr>
-            <w:tcW w:type="dxa" w:w="4564"/>
+            <w:tcW w:type="dxa" w:w="4524"/>
             <w:tcBorders>
               <w:bottom w:sz="3.184000015258789" w:val="single" w:color="#000000"/>
             </w:tcBorders>
@@ -5152,7 +5182,7 @@
               <w:autoSpaceDE w:val="0"/>
               <w:widowControl/>
               <w:spacing w:line="200" w:lineRule="exact" w:before="0" w:after="0"/>
-              <w:ind w:left="0" w:right="4" w:firstLine="0"/>
+              <w:ind w:left="0" w:right="2" w:firstLine="0"/>
               <w:jc w:val="right"/>
             </w:pPr>
             <w:r>
@@ -6141,7 +6171,7 @@
         </w:trPr>
         <w:tc>
           <w:tcPr>
-            <w:tcW w:type="dxa" w:w="4384"/>
+            <w:tcW w:type="dxa" w:w="4344"/>
             <w:tcBorders>
               <w:bottom w:sz="3.184000015258789" w:val="single" w:color="#000000"/>
             </w:tcBorders>
@@ -6183,7 +6213,7 @@
         </w:tc>
         <w:tc>
           <w:tcPr>
-            <w:tcW w:type="dxa" w:w="4984"/>
+            <w:tcW w:type="dxa" w:w="5024"/>
             <w:tcBorders>
               <w:bottom w:sz="3.184000015258789" w:val="single" w:color="#000000"/>
             </w:tcBorders>
@@ -6198,7 +6228,7 @@
               <w:autoSpaceDE w:val="0"/>
               <w:widowControl/>
               <w:spacing w:line="200" w:lineRule="exact" w:before="0" w:after="0"/>
-              <w:ind w:left="0" w:right="4" w:firstLine="0"/>
+              <w:ind w:left="0" w:right="2" w:firstLine="0"/>
               <w:jc w:val="right"/>
             </w:pPr>
             <w:r>
@@ -6209,7 +6239,17 @@
                 <w:color w:val="000000"/>
                 <w:sz w:val="20"/>
               </w:rPr>
-              <w:t>tmp.ocTMI0Grw2</w:t>
+              <w:t>Glossary</w:t>
+            </w:r>
+            <w:r>
+              <w:rPr>
+                <w:rFonts w:ascii="LMRoman10" w:hAnsi="LMRoman10" w:eastAsia="LMRoman10"/>
+                <w:b w:val="0"/>
+                <w:i w:val="0"/>
+                <w:color w:val="000000"/>
+                <w:sz w:val="20"/>
+              </w:rPr>
+              <w:t>Reference</w:t>
             </w:r>
           </w:p>
         </w:tc>
@@ -11009,7 +11049,7 @@
         </w:trPr>
         <w:tc>
           <w:tcPr>
-            <w:tcW w:type="dxa" w:w="4964"/>
+            <w:tcW w:type="dxa" w:w="5004"/>
             <w:tcBorders>
               <w:bottom w:sz="3.184000015258789" w:val="single" w:color="#000000"/>
             </w:tcBorders>
@@ -11035,13 +11075,23 @@
                 <w:color w:val="000000"/>
                 <w:sz w:val="20"/>
               </w:rPr>
-              <w:t>tmp.ocTMI0Grw2</w:t>
+              <w:t>Glossary</w:t>
+            </w:r>
+            <w:r>
+              <w:rPr>
+                <w:rFonts w:ascii="LMRoman10" w:hAnsi="LMRoman10" w:eastAsia="LMRoman10"/>
+                <w:b w:val="0"/>
+                <w:i w:val="0"/>
+                <w:color w:val="000000"/>
+                <w:sz w:val="20"/>
+              </w:rPr>
+              <w:t>Reference</w:t>
             </w:r>
           </w:p>
         </w:tc>
         <w:tc>
           <w:tcPr>
-            <w:tcW w:type="dxa" w:w="4404"/>
+            <w:tcW w:type="dxa" w:w="4364"/>
             <w:tcBorders>
               <w:bottom w:sz="3.184000015258789" w:val="single" w:color="#000000"/>
             </w:tcBorders>
@@ -14961,7 +15011,7 @@
         </w:trPr>
         <w:tc>
           <w:tcPr>
-            <w:tcW w:type="dxa" w:w="4384"/>
+            <w:tcW w:type="dxa" w:w="4344"/>
             <w:tcBorders>
               <w:bottom w:sz="3.184000015258789" w:val="single" w:color="#000000"/>
             </w:tcBorders>
@@ -15003,7 +15053,7 @@
         </w:tc>
         <w:tc>
           <w:tcPr>
-            <w:tcW w:type="dxa" w:w="4984"/>
+            <w:tcW w:type="dxa" w:w="5024"/>
             <w:tcBorders>
               <w:bottom w:sz="3.184000015258789" w:val="single" w:color="#000000"/>
             </w:tcBorders>
@@ -15018,7 +15068,7 @@
               <w:autoSpaceDE w:val="0"/>
               <w:widowControl/>
               <w:spacing w:line="200" w:lineRule="exact" w:before="0" w:after="0"/>
-              <w:ind w:left="0" w:right="4" w:firstLine="0"/>
+              <w:ind w:left="0" w:right="2" w:firstLine="0"/>
               <w:jc w:val="right"/>
             </w:pPr>
             <w:r>
@@ -15029,7 +15079,17 @@
                 <w:color w:val="000000"/>
                 <w:sz w:val="20"/>
               </w:rPr>
-              <w:t>tmp.ocTMI0Grw2</w:t>
+              <w:t>Glossary</w:t>
+            </w:r>
+            <w:r>
+              <w:rPr>
+                <w:rFonts w:ascii="LMRoman10" w:hAnsi="LMRoman10" w:eastAsia="LMRoman10"/>
+                <w:b w:val="0"/>
+                <w:i w:val="0"/>
+                <w:color w:val="000000"/>
+                <w:sz w:val="20"/>
+              </w:rPr>
+              <w:t>Reference</w:t>
             </w:r>
           </w:p>
         </w:tc>
@@ -19004,7 +19064,7 @@
         </w:trPr>
         <w:tc>
           <w:tcPr>
-            <w:tcW w:type="dxa" w:w="4964"/>
+            <w:tcW w:type="dxa" w:w="5004"/>
             <w:tcBorders>
               <w:bottom w:sz="3.184000015258789" w:val="single" w:color="#000000"/>
             </w:tcBorders>
@@ -19030,13 +19090,23 @@
                 <w:color w:val="000000"/>
                 <w:sz w:val="20"/>
               </w:rPr>
-              <w:t>tmp.ocTMI0Grw2</w:t>
+              <w:t>Glossary</w:t>
+            </w:r>
+            <w:r>
+              <w:rPr>
+                <w:rFonts w:ascii="LMRoman10" w:hAnsi="LMRoman10" w:eastAsia="LMRoman10"/>
+                <w:b w:val="0"/>
+                <w:i w:val="0"/>
+                <w:color w:val="000000"/>
+                <w:sz w:val="20"/>
+              </w:rPr>
+              <w:t>Reference</w:t>
             </w:r>
           </w:p>
         </w:tc>
         <w:tc>
           <w:tcPr>
-            <w:tcW w:type="dxa" w:w="4404"/>
+            <w:tcW w:type="dxa" w:w="4364"/>
             <w:tcBorders>
               <w:bottom w:sz="3.184000015258789" w:val="single" w:color="#000000"/>
             </w:tcBorders>
@@ -23947,7 +24017,7 @@
         </w:trPr>
         <w:tc>
           <w:tcPr>
-            <w:tcW w:type="dxa" w:w="4384"/>
+            <w:tcW w:type="dxa" w:w="4344"/>
             <w:tcBorders>
               <w:bottom w:sz="3.184000015258789" w:val="single" w:color="#000000"/>
             </w:tcBorders>
@@ -23989,7 +24059,7 @@
         </w:tc>
         <w:tc>
           <w:tcPr>
-            <w:tcW w:type="dxa" w:w="4984"/>
+            <w:tcW w:type="dxa" w:w="5024"/>
             <w:tcBorders>
               <w:bottom w:sz="3.184000015258789" w:val="single" w:color="#000000"/>
             </w:tcBorders>
@@ -24004,7 +24074,7 @@
               <w:autoSpaceDE w:val="0"/>
               <w:widowControl/>
               <w:spacing w:line="200" w:lineRule="exact" w:before="0" w:after="0"/>
-              <w:ind w:left="0" w:right="4" w:firstLine="0"/>
+              <w:ind w:left="0" w:right="2" w:firstLine="0"/>
               <w:jc w:val="right"/>
             </w:pPr>
             <w:r>
@@ -24015,7 +24085,17 @@
                 <w:color w:val="000000"/>
                 <w:sz w:val="20"/>
               </w:rPr>
-              <w:t>tmp.ocTMI0Grw2</w:t>
+              <w:t>Glossary</w:t>
+            </w:r>
+            <w:r>
+              <w:rPr>
+                <w:rFonts w:ascii="LMRoman10" w:hAnsi="LMRoman10" w:eastAsia="LMRoman10"/>
+                <w:b w:val="0"/>
+                <w:i w:val="0"/>
+                <w:color w:val="000000"/>
+                <w:sz w:val="20"/>
+              </w:rPr>
+              <w:t>Reference</w:t>
             </w:r>
           </w:p>
         </w:tc>
@@ -29501,7 +29581,7 @@
         </w:trPr>
         <w:tc>
           <w:tcPr>
-            <w:tcW w:type="dxa" w:w="4964"/>
+            <w:tcW w:type="dxa" w:w="5004"/>
             <w:tcBorders>
               <w:bottom w:sz="3.184000015258789" w:val="single" w:color="#000000"/>
             </w:tcBorders>
@@ -29527,13 +29607,23 @@
                 <w:color w:val="000000"/>
                 <w:sz w:val="20"/>
               </w:rPr>
-              <w:t>tmp.ocTMI0Grw2</w:t>
+              <w:t>Glossary</w:t>
+            </w:r>
+            <w:r>
+              <w:rPr>
+                <w:rFonts w:ascii="LMRoman10" w:hAnsi="LMRoman10" w:eastAsia="LMRoman10"/>
+                <w:b w:val="0"/>
+                <w:i w:val="0"/>
+                <w:color w:val="000000"/>
+                <w:sz w:val="20"/>
+              </w:rPr>
+              <w:t>Reference</w:t>
             </w:r>
           </w:p>
         </w:tc>
         <w:tc>
           <w:tcPr>
-            <w:tcW w:type="dxa" w:w="4404"/>
+            <w:tcW w:type="dxa" w:w="4364"/>
             <w:tcBorders>
               <w:bottom w:sz="3.184000015258789" w:val="single" w:color="#000000"/>
             </w:tcBorders>

</xml_diff>